<commit_message>
Add per-week student presentations (PDF + PPTX) and revise mentorship model
- New weekly_presentations/ folder: a student deck for each of the 10
  weeks (Week 1 = introduction), as a LaTeX Beamer PDF and an NC State-
  themed PPTX, generated from one shared source (build_weekly.py).
- Mentorship model revised: asynchronous via email/Telegram, bespoke
  ad-hoc sessions, no fixed weekly time commitment (mentor volunteers
  alongside a full-time role). Handbook tutor-mentor channel aligned.
- Regenerated syllabus/handbook .tex/.docx/.pdf.

Co-Authored-By: Claude Opus 4.8 (1M context) <noreply@anthropic.com>
</commit_message>
<xml_diff>
--- a/handbook.docx
+++ b/handbook.docx
@@ -566,25 +566,92 @@
         <w:t xml:space="preserve"> </w:t>
       </w:r>
       <w:r>
-        <w:t xml:space="preserve">evaluations. Standing channels: a weekly thirty-minute tutor–mentor sync;</w:t>
-      </w:r>
-      <w:r>
-        <w:t xml:space="preserve"> </w:t>
-      </w:r>
-      <w:r>
-        <w:t xml:space="preserve">a shared Slack workspace (mentor responds within 24 business hours); and a</w:t>
-      </w:r>
-      <w:r>
-        <w:t xml:space="preserve"> </w:t>
-      </w:r>
-      <w:r>
-        <w:t xml:space="preserve">direct phone line for crises (⚑ student in acute distress, suspected</w:t>
-      </w:r>
-      <w:r>
-        <w:t xml:space="preserve"> </w:t>
-      </w:r>
-      <w:r>
-        <w:t xml:space="preserve">integrity violation, data-security incident) — use sparingly.</w:t>
+        <w:t xml:space="preserve">evaluations. The mentor contributes on a volunteer basis alongside a</w:t>
+      </w:r>
+      <w:r>
+        <w:t xml:space="preserve"> </w:t>
+      </w:r>
+      <w:r>
+        <w:t xml:space="preserve">full-time role, so there is</w:t>
+      </w:r>
+      <w:r>
+        <w:t xml:space="preserve"> </w:t>
+      </w:r>
+      <w:r>
+        <w:rPr>
+          <w:b/>
+          <w:bCs/>
+        </w:rPr>
+        <w:t xml:space="preserve">no fixed weekly sync</w:t>
+      </w:r>
+      <w:r>
+        <w:t xml:space="preserve"> </w:t>
+      </w:r>
+      <w:r>
+        <w:t xml:space="preserve">— communication is</w:t>
+      </w:r>
+      <w:r>
+        <w:t xml:space="preserve"> </w:t>
+      </w:r>
+      <w:r>
+        <w:rPr>
+          <w:b/>
+          <w:bCs/>
+        </w:rPr>
+        <w:t xml:space="preserve">asynchronous, by email and Telegram</w:t>
+      </w:r>
+      <w:r>
+        <w:t xml:space="preserve">, with the mentor aiming to respond</w:t>
+      </w:r>
+      <w:r>
+        <w:t xml:space="preserve"> </w:t>
+      </w:r>
+      <w:r>
+        <w:t xml:space="preserve">within a few business days. Tutors batch non-urgent items into a periodic</w:t>
+      </w:r>
+      <w:r>
+        <w:t xml:space="preserve"> </w:t>
+      </w:r>
+      <w:r>
+        <w:t xml:space="preserve">written update rather than expecting a standing meeting, and arrange a live</w:t>
+      </w:r>
+      <w:r>
+        <w:t xml:space="preserve"> </w:t>
+      </w:r>
+      <w:r>
+        <w:t xml:space="preserve">call only when something genuinely needs one. For genuine crises (⚑ student</w:t>
+      </w:r>
+      <w:r>
+        <w:t xml:space="preserve"> </w:t>
+      </w:r>
+      <w:r>
+        <w:t xml:space="preserve">in acute distress, suspected integrity violation, data-security incident),</w:t>
+      </w:r>
+      <w:r>
+        <w:t xml:space="preserve"> </w:t>
+      </w:r>
+      <w:r>
+        <w:t xml:space="preserve">contact the mentor directly by phone/Telegram and flag it as urgent.</w:t>
+      </w:r>
+    </w:p>
+    <w:p>
+      <w:pPr>
+        <w:pStyle w:val="BodyText"/>
+      </w:pPr>
+      <w:r>
+        <w:t xml:space="preserve">Because the mentor’s availability is limited, tutors own the day-to-day</w:t>
+      </w:r>
+      <w:r>
+        <w:t xml:space="preserve"> </w:t>
+      </w:r>
+      <w:r>
+        <w:t xml:space="preserve">program and should resolve what they can independently, escalating to the</w:t>
+      </w:r>
+      <w:r>
+        <w:t xml:space="preserve"> </w:t>
+      </w:r>
+      <w:r>
+        <w:t xml:space="preserve">mentor only what truly requires the mentor’s decision.</w:t>
       </w:r>
     </w:p>
     <w:p>

</xml_diff>